<commit_message>
updated read me to inculde instructions
</commit_message>
<xml_diff>
--- a/RogerJennifer-FinalProject.docx
+++ b/RogerJennifer-FinalProject.docx
@@ -4,6 +4,16 @@
   <w:body>
     <w:p>
       <w:hyperlink r:id="rId5" w:history="1">
+        <w:r>
+          <w:rPr>
+            <w:rStyle w:val="Hyperlink"/>
+          </w:rPr>
+          <w:t>https://jennifer-rogers.github.io/web-project/</w:t>
+        </w:r>
+      </w:hyperlink>
+    </w:p>
+    <w:p>
+      <w:hyperlink r:id="rId6" w:history="1">
         <w:r>
           <w:rPr>
             <w:rStyle w:val="Hyperlink"/>
@@ -13,7 +23,7 @@
       </w:hyperlink>
     </w:p>
     <w:p>
-      <w:hyperlink r:id="rId6" w:history="1">
+      <w:hyperlink r:id="rId7" w:history="1">
         <w:r>
           <w:rPr>
             <w:rStyle w:val="Hyperlink"/>
@@ -23,7 +33,7 @@
       </w:hyperlink>
     </w:p>
     <w:p>
-      <w:hyperlink r:id="rId7" w:history="1">
+      <w:hyperlink r:id="rId8" w:history="1">
         <w:r>
           <w:rPr>
             <w:rStyle w:val="Hyperlink"/>
@@ -33,7 +43,7 @@
       </w:hyperlink>
     </w:p>
     <w:p>
-      <w:hyperlink r:id="rId8" w:history="1">
+      <w:hyperlink r:id="rId9" w:history="1">
         <w:r>
           <w:rPr>
             <w:rStyle w:val="Hyperlink"/>
@@ -43,7 +53,7 @@
       </w:hyperlink>
     </w:p>
     <w:p>
-      <w:hyperlink r:id="rId9" w:history="1">
+      <w:hyperlink r:id="rId10" w:history="1">
         <w:r>
           <w:rPr>
             <w:rStyle w:val="Hyperlink"/>
@@ -61,7 +71,7 @@
           <w:noProof/>
         </w:rPr>
         <w:drawing>
-          <wp:inline distT="0" distB="0" distL="0" distR="0" wp14:anchorId="4EA6867B" wp14:editId="5F4827F0">
+          <wp:inline distT="0" distB="0" distL="0" distR="0" wp14:anchorId="4EA6867B" wp14:editId="1DF848E1">
             <wp:extent cx="5943600" cy="2796540"/>
             <wp:effectExtent l="0" t="0" r="0" b="3810"/>
             <wp:docPr id="322962275" name="Picture 1"/>
@@ -76,7 +86,7 @@
                     <pic:cNvPicPr/>
                   </pic:nvPicPr>
                   <pic:blipFill>
-                    <a:blip r:embed="rId10" cstate="print">
+                    <a:blip r:embed="rId11" cstate="print">
                       <a:extLst>
                         <a:ext uri="{28A0092B-C50C-407E-A947-70E740481C1C}">
                           <a14:useLocalDpi xmlns:a14="http://schemas.microsoft.com/office/drawing/2010/main" val="0"/>
@@ -137,7 +147,7 @@
           <w:noProof/>
         </w:rPr>
         <w:drawing>
-          <wp:inline distT="0" distB="0" distL="0" distR="0" wp14:anchorId="1F484C63" wp14:editId="121F8BF0">
+          <wp:inline distT="0" distB="0" distL="0" distR="0" wp14:anchorId="1F484C63" wp14:editId="3D1306CA">
             <wp:extent cx="5943600" cy="2527300"/>
             <wp:effectExtent l="0" t="0" r="0" b="6350"/>
             <wp:docPr id="1732258181" name="Picture 2"/>
@@ -152,7 +162,7 @@
                     <pic:cNvPicPr/>
                   </pic:nvPicPr>
                   <pic:blipFill>
-                    <a:blip r:embed="rId11" cstate="print">
+                    <a:blip r:embed="rId12" cstate="print">
                       <a:extLst>
                         <a:ext uri="{28A0092B-C50C-407E-A947-70E740481C1C}">
                           <a14:useLocalDpi xmlns:a14="http://schemas.microsoft.com/office/drawing/2010/main" val="0"/>
@@ -214,7 +224,7 @@
         </w:rPr>
         <w:lastRenderedPageBreak/>
         <w:drawing>
-          <wp:inline distT="0" distB="0" distL="0" distR="0" wp14:anchorId="1F898E0D" wp14:editId="37D21940">
+          <wp:inline distT="0" distB="0" distL="0" distR="0" wp14:anchorId="1F898E0D" wp14:editId="30A4CB2B">
             <wp:extent cx="5943600" cy="1907540"/>
             <wp:effectExtent l="0" t="0" r="0" b="0"/>
             <wp:docPr id="1601562476" name="Picture 3"/>
@@ -229,7 +239,7 @@
                     <pic:cNvPicPr/>
                   </pic:nvPicPr>
                   <pic:blipFill>
-                    <a:blip r:embed="rId12" cstate="print">
+                    <a:blip r:embed="rId13" cstate="print">
                       <a:extLst>
                         <a:ext uri="{28A0092B-C50C-407E-A947-70E740481C1C}">
                           <a14:useLocalDpi xmlns:a14="http://schemas.microsoft.com/office/drawing/2010/main" val="0"/>
@@ -290,7 +300,7 @@
           <w:noProof/>
         </w:rPr>
         <w:drawing>
-          <wp:inline distT="0" distB="0" distL="0" distR="0" wp14:anchorId="0A31EB25" wp14:editId="466F530E">
+          <wp:inline distT="0" distB="0" distL="0" distR="0" wp14:anchorId="0A31EB25" wp14:editId="6A67F166">
             <wp:extent cx="5943600" cy="2131695"/>
             <wp:effectExtent l="0" t="0" r="0" b="1905"/>
             <wp:docPr id="299772983" name="Picture 4"/>
@@ -305,7 +315,7 @@
                     <pic:cNvPicPr/>
                   </pic:nvPicPr>
                   <pic:blipFill>
-                    <a:blip r:embed="rId13" cstate="print">
+                    <a:blip r:embed="rId14" cstate="print">
                       <a:extLst>
                         <a:ext uri="{28A0092B-C50C-407E-A947-70E740481C1C}">
                           <a14:useLocalDpi xmlns:a14="http://schemas.microsoft.com/office/drawing/2010/main" val="0"/>
@@ -366,7 +376,7 @@
           <w:noProof/>
         </w:rPr>
         <w:drawing>
-          <wp:inline distT="0" distB="0" distL="0" distR="0" wp14:anchorId="523B13DE" wp14:editId="229B99FD">
+          <wp:inline distT="0" distB="0" distL="0" distR="0" wp14:anchorId="523B13DE" wp14:editId="7C873778">
             <wp:extent cx="5943600" cy="2863215"/>
             <wp:effectExtent l="0" t="0" r="0" b="0"/>
             <wp:docPr id="30490173" name="Picture 5"/>
@@ -381,7 +391,7 @@
                     <pic:cNvPicPr/>
                   </pic:nvPicPr>
                   <pic:blipFill>
-                    <a:blip r:embed="rId14" cstate="print">
+                    <a:blip r:embed="rId15" cstate="print">
                       <a:extLst>
                         <a:ext uri="{28A0092B-C50C-407E-A947-70E740481C1C}">
                           <a14:useLocalDpi xmlns:a14="http://schemas.microsoft.com/office/drawing/2010/main" val="0"/>
@@ -458,7 +468,7 @@
                     <pic:cNvPicPr/>
                   </pic:nvPicPr>
                   <pic:blipFill>
-                    <a:blip r:embed="rId15" cstate="print">
+                    <a:blip r:embed="rId16" cstate="print">
                       <a:extLst>
                         <a:ext uri="{28A0092B-C50C-407E-A947-70E740481C1C}">
                           <a14:useLocalDpi xmlns:a14="http://schemas.microsoft.com/office/drawing/2010/main" val="0"/>
@@ -540,7 +550,7 @@
                     <pic:cNvPicPr/>
                   </pic:nvPicPr>
                   <pic:blipFill>
-                    <a:blip r:embed="rId16" cstate="print">
+                    <a:blip r:embed="rId17" cstate="print">
                       <a:extLst>
                         <a:ext uri="{28A0092B-C50C-407E-A947-70E740481C1C}">
                           <a14:useLocalDpi xmlns:a14="http://schemas.microsoft.com/office/drawing/2010/main" val="0"/>
@@ -623,7 +633,7 @@
                     <pic:cNvPicPr/>
                   </pic:nvPicPr>
                   <pic:blipFill>
-                    <a:blip r:embed="rId17" cstate="print">
+                    <a:blip r:embed="rId18" cstate="print">
                       <a:extLst>
                         <a:ext uri="{28A0092B-C50C-407E-A947-70E740481C1C}">
                           <a14:useLocalDpi xmlns:a14="http://schemas.microsoft.com/office/drawing/2010/main" val="0"/>
@@ -705,7 +715,7 @@
                     <pic:cNvPicPr/>
                   </pic:nvPicPr>
                   <pic:blipFill>
-                    <a:blip r:embed="rId18" cstate="print">
+                    <a:blip r:embed="rId19" cstate="print">
                       <a:extLst>
                         <a:ext uri="{28A0092B-C50C-407E-A947-70E740481C1C}">
                           <a14:useLocalDpi xmlns:a14="http://schemas.microsoft.com/office/drawing/2010/main" val="0"/>
@@ -788,7 +798,7 @@
                     <pic:cNvPicPr/>
                   </pic:nvPicPr>
                   <pic:blipFill>
-                    <a:blip r:embed="rId19" cstate="print">
+                    <a:blip r:embed="rId20" cstate="print">
                       <a:extLst>
                         <a:ext uri="{28A0092B-C50C-407E-A947-70E740481C1C}">
                           <a14:useLocalDpi xmlns:a14="http://schemas.microsoft.com/office/drawing/2010/main" val="0"/>

</xml_diff>